<commit_message>
Standardize project name to Ecosystem Discovery App
</commit_message>
<xml_diff>
--- a/documents/docx/Business_Case_GroupG_EcosystemApp.pdf.docx
+++ b/documents/docx/Business_Case_GroupG_EcosystemApp.pdf.docx
@@ -167,7 +167,19 @@
                 <w:szCs w:val="24"/>
                 <w:lang w:eastAsia="en-CA"/>
               </w:rPr>
-              <w:t>Ecosystem Educational Discovery Application</w:t>
+              <w:t>Ecosystem Discovery App</w:t>
+            </w:r>
+            <w:r>
+              <w:rPr>
+                <w:rFonts w:ascii="Times New Roman" w:eastAsia="Arial" w:hAnsi="Times New Roman" w:cs="Times New Roman"/>
+                <w:b/>
+                <w:bCs/>
+                <w:color w:val="000000"/>
+                <w:sz w:val="24"/>
+                <w:szCs w:val="24"/>
+                <w:lang w:eastAsia="en-CA"/>
+              </w:rPr>
+              <w:t>lication</w:t>
             </w:r>
           </w:p>
           <w:p>
@@ -591,27 +603,7 @@
                 <w:szCs w:val="24"/>
                 <w:lang w:eastAsia="en-CA"/>
               </w:rPr>
-              <w:t xml:space="preserve">There is a need for </w:t>
-            </w:r>
-            <w:r>
-              <w:rPr>
-                <w:rFonts w:ascii="Times New Roman" w:eastAsia="Arial" w:hAnsi="Times New Roman" w:cs="Times New Roman"/>
-                <w:color w:val="000000"/>
-                <w:sz w:val="24"/>
-                <w:szCs w:val="24"/>
-                <w:lang w:eastAsia="en-CA"/>
-              </w:rPr>
-              <w:t>engaging</w:t>
-            </w:r>
-            <w:r>
-              <w:rPr>
-                <w:rFonts w:ascii="Times New Roman" w:eastAsia="Arial" w:hAnsi="Times New Roman" w:cs="Times New Roman"/>
-                <w:color w:val="000000"/>
-                <w:sz w:val="24"/>
-                <w:szCs w:val="24"/>
-                <w:lang w:eastAsia="en-CA"/>
-              </w:rPr>
-              <w:t xml:space="preserve"> age-appropriate educational tools that help elementary school children actively learn about freshwater ecosystems and conservation. Traditional approaches rely heavily on passive learning, which can reduce understanding and retention.</w:t>
+              <w:t>There is a need for engaging age-appropriate educational tools that help elementary school children actively learn about freshwater ecosystems and conservation. Traditional approaches rely heavily on passive learning, which can reduce understanding and retention.</w:t>
             </w:r>
           </w:p>
           <w:p>
@@ -3333,6 +3325,7 @@
   <w:style w:type="character" w:default="1" w:styleId="DefaultParagraphFont">
     <w:name w:val="Default Paragraph Font"/>
     <w:uiPriority w:val="1"/>
+    <w:semiHidden/>
     <w:unhideWhenUsed/>
   </w:style>
   <w:style w:type="table" w:default="1" w:styleId="TableNormal">

</xml_diff>